<commit_message>
Deliver round 28 local Windows guide, cognitive review material and acceptance
</commit_message>
<xml_diff>
--- a/docs/preview-deployment-operations.docx
+++ b/docs/preview-deployment-operations.docx
@@ -8,6 +8,11 @@
       </w:pPr>
       <w:r>
         <w:t>研究者内部体验部署：服务申请与逐步操作</w:t>
+      </w:r>
+    </w:p>
+    <w:p>
+      <w:r>
+        <w:t>最新优先级：本人体验先使用 Windows 本地入口（windows-local-researcher-preview.md），无需服务器／域名。本指南保留给之后的导师／多人远程阶段。</w:t>
       </w:r>
     </w:p>
     <w:p>
@@ -467,15 +472,13 @@
     </w:p>
     <w:p>
       <w:r>
-        <w:t>bash</w:t>
-      </w:r>
-    </w:p>
-    <w:p>
-      <w:r>
+        <w:rPr>
+          <w:rFonts w:ascii="Consolas" w:hAnsi="Consolas"/>
+          <w:sz w:val="18"/>
+        </w:rPr>
         <w:t>scp '/你的本机路径/项目.zip' root@SERVER_IP:/tmp/researcher-project.zip</w:t>
       </w:r>
     </w:p>
-    <w:p/>
     <w:p>
       <w:r>
         <w:t>4. 在服务器以运维身份创建专用用户、目录并解压。以下命令针对全新独立主机；如果已有 research 用户或目录，先检查，不能覆盖原项目：</w:t>
@@ -483,30 +486,40 @@
     </w:p>
     <w:p>
       <w:r>
-        <w:t>bash</w:t>
-      </w:r>
-    </w:p>
-    <w:p>
-      <w:r>
+        <w:rPr>
+          <w:rFonts w:ascii="Consolas" w:hAnsi="Consolas"/>
+          <w:sz w:val="18"/>
+        </w:rPr>
         <w:t>sudo useradd --create-home --shell /bin/bash research</w:t>
       </w:r>
     </w:p>
     <w:p>
       <w:r>
+        <w:rPr>
+          <w:rFonts w:ascii="Consolas" w:hAnsi="Consolas"/>
+          <w:sz w:val="18"/>
+        </w:rPr>
         <w:t>sudo usermod -aG docker research</w:t>
       </w:r>
     </w:p>
     <w:p>
       <w:r>
+        <w:rPr>
+          <w:rFonts w:ascii="Consolas" w:hAnsi="Consolas"/>
+          <w:sz w:val="18"/>
+        </w:rPr>
         <w:t>sudo mkdir -p /srv/AI-Agent-Research-Platform</w:t>
       </w:r>
     </w:p>
     <w:p>
       <w:r>
+        <w:rPr>
+          <w:rFonts w:ascii="Consolas" w:hAnsi="Consolas"/>
+          <w:sz w:val="18"/>
+        </w:rPr>
         <w:t>sudo unzip /tmp/researcher-project.zip -d /srv/researcher-unpack</w:t>
       </w:r>
     </w:p>
-    <w:p/>
     <w:p>
       <w:r>
         <w:t>GitHub ZIP 有一层顶级目录。将该目录内容复制到 /srv/AI-Agent-Research-Platform/，确认 package.json 直接位于这个路径，然后：</w:t>
@@ -514,25 +527,31 @@
     </w:p>
     <w:p>
       <w:r>
-        <w:t>bash</w:t>
-      </w:r>
-    </w:p>
-    <w:p>
-      <w:r>
+        <w:rPr>
+          <w:rFonts w:ascii="Consolas" w:hAnsi="Consolas"/>
+          <w:sz w:val="18"/>
+        </w:rPr>
         <w:t>sudo chown -R research:research /srv/AI-Agent-Research-Platform</w:t>
       </w:r>
     </w:p>
     <w:p>
       <w:r>
+        <w:rPr>
+          <w:rFonts w:ascii="Consolas" w:hAnsi="Consolas"/>
+          <w:sz w:val="18"/>
+        </w:rPr>
         <w:t>sudo -u research bash -lc 'cd /srv/AI-Agent-Research-Platform &amp;&amp; npm ci &amp;&amp; npm run build'</w:t>
       </w:r>
     </w:p>
     <w:p>
       <w:r>
+        <w:rPr>
+          <w:rFonts w:ascii="Consolas" w:hAnsi="Consolas"/>
+          <w:sz w:val="18"/>
+        </w:rPr>
         <w:t>sudo -u research docker pull postgres:17.7-alpine@sha256:bb377b7239d2774ac8cc76f481596ce96c5a6b5e9d141f6d0a0ee371a6e7c0f2</w:t>
       </w:r>
     </w:p>
-    <w:p/>
     <w:p>
       <w:r>
         <w:t>Docker 组具有服务器管理能力，因此此权限仅用于专用测试主机。不要在共享生产服务器随意授予。</w:t>
@@ -545,40 +564,58 @@
     </w:p>
     <w:p>
       <w:r>
-        <w:t>bash</w:t>
-      </w:r>
-    </w:p>
-    <w:p>
-      <w:r>
+        <w:rPr>
+          <w:rFonts w:ascii="Consolas" w:hAnsi="Consolas"/>
+          <w:sz w:val="18"/>
+        </w:rPr>
         <w:t>sudo install -m 600 /srv/AI-Agent-Research-Platform/deploy/researcher-preview.env.example /etc/researcher-preview.env</w:t>
       </w:r>
     </w:p>
     <w:p>
       <w:r>
+        <w:rPr>
+          <w:rFonts w:ascii="Consolas" w:hAnsi="Consolas"/>
+          <w:sz w:val="18"/>
+        </w:rPr>
         <w:t>sudoedit /etc/researcher-preview.env</w:t>
       </w:r>
     </w:p>
     <w:p>
       <w:r>
+        <w:rPr>
+          <w:rFonts w:ascii="Consolas" w:hAnsi="Consolas"/>
+          <w:sz w:val="18"/>
+        </w:rPr>
         <w:t>sudo install -m 644 /srv/AI-Agent-Research-Platform/deploy/researcher-preview.service /etc/systemd/system/researcher-preview.service</w:t>
       </w:r>
     </w:p>
     <w:p>
       <w:r>
+        <w:rPr>
+          <w:rFonts w:ascii="Consolas" w:hAnsi="Consolas"/>
+          <w:sz w:val="18"/>
+        </w:rPr>
         <w:t>sudo systemctl daemon-reload</w:t>
       </w:r>
     </w:p>
     <w:p>
       <w:r>
+        <w:rPr>
+          <w:rFonts w:ascii="Consolas" w:hAnsi="Consolas"/>
+          <w:sz w:val="18"/>
+        </w:rPr>
         <w:t>sudo systemctl enable --now researcher-preview</w:t>
       </w:r>
     </w:p>
     <w:p>
       <w:r>
+        <w:rPr>
+          <w:rFonts w:ascii="Consolas" w:hAnsi="Consolas"/>
+          <w:sz w:val="18"/>
+        </w:rPr>
         <w:t>sudo systemctl status researcher-preview --no-pager</w:t>
       </w:r>
     </w:p>
-    <w:p/>
     <w:p>
       <w:r>
         <w:t>在 sudoedit 中填写 DEEPSEEK_API_KEY，端口保留 4173；不要截图此文件，不要打印密钥。启动工具只创建自己的数据库／账号，不使用外部 DATABASE_URL，不连接 WorkBuddy。若日志出现端口占用，先核实已有监听者，不能停止不属于本部署的进程；当前云验证曾遇到 4173 已占用，使用受支持的 4184 覆盖完成检查，未终止原进程。</w:t>
@@ -591,20 +628,22 @@
     </w:p>
     <w:p>
       <w:r>
-        <w:t>bash</w:t>
-      </w:r>
-    </w:p>
-    <w:p>
-      <w:r>
+        <w:rPr>
+          <w:rFonts w:ascii="Consolas" w:hAnsi="Consolas"/>
+          <w:sz w:val="18"/>
+        </w:rPr>
         <w:t>sudo caddy validate --config /etc/caddy/Caddyfile</w:t>
       </w:r>
     </w:p>
     <w:p>
       <w:r>
+        <w:rPr>
+          <w:rFonts w:ascii="Consolas" w:hAnsi="Consolas"/>
+          <w:sz w:val="18"/>
+        </w:rPr>
         <w:t>sudo systemctl reload caddy</w:t>
       </w:r>
     </w:p>
-    <w:p/>
     <w:p>
       <w:r>
         <w:t>7. 从研究者自己的另一台设备打开实际 HTTPS 域名。证书有效、首页和 JS 资源加载、三个账号能登录，才算对外入口通过。服务器内部 health 200 不能单独证明浏览器、数据库、模型或外部 HTTPS 可用。本轮不提供未创建的域名示例作为点击链接。</w:t>
@@ -1029,13 +1068,7 @@
     <w:pPr>
       <w:pStyle w:val="Footer"/>
     </w:pPr>
-    <w:r>
-      <w:t xml:space="preserve">第 </w:t>
-    </w:r>
     <w:fldSimple w:instr="PAGE"/>
-    <w:r>
-      <w:t xml:space="preserve"> 页</w:t>
-    </w:r>
   </w:p>
 </w:ftr>
 </file>
@@ -1047,7 +1080,7 @@
       <w:pStyle w:val="Header"/>
     </w:pPr>
     <w:r>
-      <w:t>AI Agent Research Platform · 第27次交付 · 导师门禁未放行</w:t>
+      <w:t>AI Agent Research Platform · 第28次交付 · 本地体验优先／导师未放行</w:t>
     </w:r>
   </w:p>
 </w:hdr>

</xml_diff>